<commit_message>
Report: remove declaration page and centre the cover
Co-Authored-By: Claude Opus 5.5 <noreply@anthropic.com>
Claude-Session: https://claude.ai/code/session_01SefLkeJGfqSPbmYLA9m1RC
</commit_message>
<xml_diff>
--- a/docs/internship-report/REYHAAN_INTERNSHIP_COMPLETION_REPORT.docx
+++ b/docs/internship-report/REYHAAN_INTERNSHIP_COMPLETION_REPORT.docx
@@ -4,7 +4,7 @@
   <w:body>
     <w:p>
       <w:pPr>
-        <w:spacing w:after="296" w:before="0" w:line="288"/>
+        <w:spacing w:after="126" w:before="1950" w:line="288"/>
         <w:jc w:val="center"/>
       </w:pPr>
       <w:r>
@@ -19,7 +19,7 @@
     </w:p>
     <w:p>
       <w:pPr>
-        <w:spacing w:after="506" w:before="0" w:line="288"/>
+        <w:spacing w:after="336" w:before="0" w:line="288"/>
         <w:jc w:val="center"/>
       </w:pPr>
       <w:r>
@@ -32,7 +32,7 @@
     </w:p>
     <w:p>
       <w:pPr>
-        <w:spacing w:after="254" w:before="0" w:line="288"/>
+        <w:spacing w:after="84" w:before="0" w:line="288"/>
         <w:jc w:val="center"/>
       </w:pPr>
       <w:r>
@@ -47,7 +47,7 @@
     </w:p>
     <w:p>
       <w:pPr>
-        <w:spacing w:after="296" w:before="0" w:line="288"/>
+        <w:spacing w:after="126" w:before="0" w:line="288"/>
         <w:jc w:val="center"/>
       </w:pPr>
       <w:r>
@@ -62,7 +62,7 @@
     </w:p>
     <w:p>
       <w:pPr>
-        <w:spacing w:after="506" w:before="0" w:line="288"/>
+        <w:spacing w:after="336" w:before="0" w:line="288"/>
         <w:jc w:val="center"/>
       </w:pPr>
       <w:r>
@@ -100,7 +100,7 @@
     </w:p>
     <w:p>
       <w:pPr>
-        <w:spacing w:after="254" w:before="0" w:line="288"/>
+        <w:spacing w:after="84" w:before="0" w:line="288"/>
         <w:jc w:val="center"/>
       </w:pPr>
       <w:r>
@@ -117,7 +117,7 @@
     </w:p>
     <w:p>
       <w:pPr>
-        <w:spacing w:after="506" w:before="0" w:line="288"/>
+        <w:spacing w:after="336" w:before="0" w:line="288"/>
         <w:jc w:val="center"/>
       </w:pPr>
       <w:r>
@@ -132,7 +132,7 @@
     </w:p>
     <w:p>
       <w:pPr>
-        <w:spacing w:after="296"/>
+        <w:spacing w:after="126"/>
         <w:jc w:val="center"/>
       </w:pPr>
       <w:r>
@@ -178,7 +178,7 @@
     </w:p>
     <w:p>
       <w:pPr>
-        <w:spacing w:after="590" w:before="0" w:line="288"/>
+        <w:spacing w:after="420" w:before="0" w:line="288"/>
         <w:jc w:val="center"/>
       </w:pPr>
       <w:r>
@@ -191,7 +191,7 @@
     </w:p>
     <w:p>
       <w:pPr>
-        <w:spacing w:after="296" w:before="0" w:line="288"/>
+        <w:spacing w:after="126" w:before="0" w:line="288"/>
         <w:jc w:val="center"/>
       </w:pPr>
       <w:r>
@@ -208,7 +208,7 @@
     </w:p>
     <w:p>
       <w:pPr>
-        <w:spacing w:after="212" w:before="0" w:line="288"/>
+        <w:spacing w:after="42" w:before="0" w:line="288"/>
         <w:jc w:val="center"/>
       </w:pPr>
       <w:r>
@@ -223,7 +223,7 @@
     </w:p>
     <w:p>
       <w:pPr>
-        <w:spacing w:after="212" w:before="0" w:line="288"/>
+        <w:spacing w:after="42" w:before="0" w:line="288"/>
         <w:jc w:val="center"/>
       </w:pPr>
       <w:r>
@@ -238,7 +238,7 @@
     </w:p>
     <w:p>
       <w:pPr>
-        <w:spacing w:after="464" w:before="0" w:line="288"/>
+        <w:spacing w:after="294" w:before="0" w:line="288"/>
         <w:jc w:val="center"/>
       </w:pPr>
       <w:r>
@@ -253,7 +253,7 @@
     </w:p>
     <w:p>
       <w:pPr>
-        <w:spacing w:after="338"/>
+        <w:spacing w:after="168"/>
         <w:jc w:val="center"/>
       </w:pPr>
       <w:r>
@@ -299,7 +299,7 @@
     </w:p>
     <w:p>
       <w:pPr>
-        <w:spacing w:after="212" w:before="0" w:line="288"/>
+        <w:spacing w:after="42" w:before="0" w:line="288"/>
         <w:jc w:val="center"/>
       </w:pPr>
       <w:r>
@@ -314,7 +314,7 @@
     </w:p>
     <w:p>
       <w:pPr>
-        <w:spacing w:after="212" w:before="0" w:line="288"/>
+        <w:spacing w:after="42" w:before="0" w:line="288"/>
         <w:jc w:val="center"/>
       </w:pPr>
       <w:r>
@@ -327,7 +327,7 @@
     </w:p>
     <w:p>
       <w:pPr>
-        <w:spacing w:after="212" w:before="0" w:line="288"/>
+        <w:spacing w:after="42" w:before="0" w:line="288"/>
         <w:jc w:val="center"/>
       </w:pPr>
       <w:r>
@@ -340,7 +340,7 @@
     </w:p>
     <w:p>
       <w:pPr>
-        <w:spacing w:after="422" w:before="0" w:line="288"/>
+        <w:spacing w:after="252" w:before="0" w:line="288"/>
         <w:jc w:val="center"/>
       </w:pPr>
       <w:r>
@@ -388,118 +388,6 @@
           <w:sz w:val="30"/>
           <w:szCs w:val="30"/>
         </w:rPr>
-        <w:t xml:space="preserve">DECLARATION</w:t>
-      </w:r>
-    </w:p>
-    <w:p>
-      <w:pPr>
-        <w:spacing w:after="200" w:before="0" w:line="360"/>
-        <w:jc w:val="both"/>
-      </w:pPr>
-      <w:r>
-        <w:t xml:space="preserve">I, </w:t>
-      </w:r>
-      <w:r>
-        <w:rPr>
-          <w:b/>
-          <w:bCs/>
-        </w:rPr>
-        <w:t xml:space="preserve">Reyhaan S</w:t>
-      </w:r>
-      <w:r>
-        <w:t xml:space="preserve"> (Register No. 312325205176), a student of B.Tech. Information Technology, St. Joseph’s College of Engineering, Chennai, hereby declare that this internship report entitled </w:t>
-      </w:r>
-      <w:r>
-        <w:rPr>
-          <w:b/>
-          <w:bCs/>
-        </w:rPr>
-        <w:t xml:space="preserve">“ShopSphere — Multi-Vendor Social E-Commerce Platform”</w:t>
-      </w:r>
-      <w:r>
-        <w:t xml:space="preserve"> is a record of the internship I undertook at </w:t>
-      </w:r>
-      <w:r>
-        <w:rPr>
-          <w:b/>
-          <w:bCs/>
-        </w:rPr>
-        <w:t xml:space="preserve">TechPower Solutions</w:t>
-      </w:r>
-      <w:r>
-        <w:t xml:space="preserve">, Chennai, from 18 June 2026 to 15 September 2026, submitted in partial fulfilment of the requirements for the Industry Internship Program.</w:t>
-      </w:r>
-    </w:p>
-    <w:p>
-      <w:pPr>
-        <w:spacing w:after="600" w:before="0" w:line="360"/>
-        <w:jc w:val="both"/>
-      </w:pPr>
-      <w:r>
-        <w:t xml:space="preserve">The project described in this report was developed jointly by the teams </w:t>
-      </w:r>
-      <w:r>
-        <w:rPr>
-          <w:b/>
-          <w:bCs/>
-        </w:rPr>
-        <w:t xml:space="preserve">Control + Alt + Win and SEME Forces</w:t>
-      </w:r>
-      <w:r>
-        <w:t xml:space="preserve">. My individual contribution, principally authentication, authorization, the shared login, security validation and integration, is identified in Chapter 7; the work of other team members is acknowledged as theirs. The technical descriptions, screenshots and test results in this report were prepared from the project repository and the running application, and have not been submitted elsewhere for the award of any degree.</w:t>
-      </w:r>
-    </w:p>
-    <w:p>
-      <w:pPr>
-        <w:tabs>
-          <w:tab w:val="right" w:pos="8660"/>
-        </w:tabs>
-        <w:spacing w:after="120"/>
-      </w:pPr>
-      <w:r>
-        <w:rPr>
-          <w:sz w:val="24"/>
-          <w:szCs w:val="24"/>
-        </w:rPr>
-        <w:t xml:space="preserve">Place: Chennai	Signature of the Student</w:t>
-      </w:r>
-    </w:p>
-    <w:p>
-      <w:pPr>
-        <w:tabs>
-          <w:tab w:val="right" w:pos="8660"/>
-        </w:tabs>
-      </w:pPr>
-      <w:r>
-        <w:rPr>
-          <w:sz w:val="24"/>
-          <w:szCs w:val="24"/>
-        </w:rPr>
-        <w:t xml:space="preserve">Date: ____________	</w:t>
-      </w:r>
-      <w:r>
-        <w:rPr>
-          <w:b/>
-          <w:bCs/>
-          <w:sz w:val="24"/>
-          <w:szCs w:val="24"/>
-        </w:rPr>
-        <w:t xml:space="preserve">REYHAAN S (312325205176)</w:t>
-      </w:r>
-    </w:p>
-    <w:p>
-      <w:pPr>
-        <w:pageBreakBefore/>
-        <w:spacing w:after="300"/>
-        <w:jc w:val="center"/>
-      </w:pPr>
-      <w:r>
-        <w:rPr>
-          <w:b/>
-          <w:bCs/>
-          <w:sz w:val="30"/>
-          <w:szCs w:val="30"/>
-        </w:rPr>
         <w:t xml:space="preserve">ACKNOWLEDGEMENT</w:t>
       </w:r>
     </w:p>
@@ -755,7 +643,7 @@
           <w:sz w:val="21"/>
           <w:szCs w:val="21"/>
         </w:rPr>
-        <w:t xml:space="preserve">DECLARATION	i</w:t>
+        <w:t xml:space="preserve">ACKNOWLEDGEMENT	i</w:t>
       </w:r>
     </w:p>
     <w:p>
@@ -773,7 +661,7 @@
           <w:sz w:val="21"/>
           <w:szCs w:val="21"/>
         </w:rPr>
-        <w:t xml:space="preserve">ACKNOWLEDGEMENT	ii</w:t>
+        <w:t xml:space="preserve">ABSTRACT	ii</w:t>
       </w:r>
     </w:p>
     <w:p>
@@ -791,7 +679,7 @@
           <w:sz w:val="21"/>
           <w:szCs w:val="21"/>
         </w:rPr>
-        <w:t xml:space="preserve">ABSTRACT	iii</w:t>
+        <w:t xml:space="preserve">LIST OF FIGURES AND TABLES	iv</w:t>
       </w:r>
     </w:p>
     <w:p>
@@ -809,7 +697,79 @@
           <w:sz w:val="21"/>
           <w:szCs w:val="21"/>
         </w:rPr>
-        <w:t xml:space="preserve">LIST OF FIGURES AND TABLES	v</w:t>
+        <w:t xml:space="preserve">1. INTRODUCTION AND COMPANY PROFILE	1</w:t>
+      </w:r>
+    </w:p>
+    <w:p>
+      <w:pPr>
+        <w:tabs>
+          <w:tab w:val="right" w:pos="8660" w:leader="dot"/>
+        </w:tabs>
+        <w:spacing w:after="0" w:before="0" w:line="250"/>
+        <w:ind w:left="440"/>
+      </w:pPr>
+      <w:r>
+        <w:rPr>
+          <w:b w:val="false"/>
+          <w:bCs w:val="false"/>
+          <w:sz w:val="21"/>
+          <w:szCs w:val="21"/>
+        </w:rPr>
+        <w:t xml:space="preserve">1.1  Overview of the Internship	1</w:t>
+      </w:r>
+    </w:p>
+    <w:p>
+      <w:pPr>
+        <w:tabs>
+          <w:tab w:val="right" w:pos="8660" w:leader="dot"/>
+        </w:tabs>
+        <w:spacing w:after="0" w:before="0" w:line="250"/>
+        <w:ind w:left="440"/>
+      </w:pPr>
+      <w:r>
+        <w:rPr>
+          <w:b w:val="false"/>
+          <w:bCs w:val="false"/>
+          <w:sz w:val="21"/>
+          <w:szCs w:val="21"/>
+        </w:rPr>
+        <w:t xml:space="preserve">1.2  Company Profile	1</w:t>
+      </w:r>
+    </w:p>
+    <w:p>
+      <w:pPr>
+        <w:tabs>
+          <w:tab w:val="right" w:pos="8660" w:leader="dot"/>
+        </w:tabs>
+        <w:spacing w:after="0" w:before="0" w:line="250"/>
+        <w:ind w:left="440"/>
+      </w:pPr>
+      <w:r>
+        <w:rPr>
+          <w:b w:val="false"/>
+          <w:bCs w:val="false"/>
+          <w:sz w:val="21"/>
+          <w:szCs w:val="21"/>
+        </w:rPr>
+        <w:t xml:space="preserve">1.3  Objectives of the Internship	1</w:t>
+      </w:r>
+    </w:p>
+    <w:p>
+      <w:pPr>
+        <w:tabs>
+          <w:tab w:val="right" w:pos="8660" w:leader="dot"/>
+        </w:tabs>
+        <w:spacing w:after="0" w:before="0" w:line="250"/>
+        <w:ind w:left="440"/>
+      </w:pPr>
+      <w:r>
+        <w:rPr>
+          <w:b w:val="false"/>
+          <w:bCs w:val="false"/>
+          <w:sz w:val="21"/>
+          <w:szCs w:val="21"/>
+        </w:rPr>
+        <w:t xml:space="preserve">1.4  Scope and Organisation of the Report	2</w:t>
       </w:r>
     </w:p>
     <w:p>
@@ -827,7 +787,7 @@
           <w:sz w:val="21"/>
           <w:szCs w:val="21"/>
         </w:rPr>
-        <w:t xml:space="preserve">1. INTRODUCTION AND COMPANY PROFILE	1</w:t>
+        <w:t xml:space="preserve">2. PROJECT OVERVIEW AND REQUIREMENTS	3</w:t>
       </w:r>
     </w:p>
     <w:p>
@@ -845,7 +805,7 @@
           <w:sz w:val="21"/>
           <w:szCs w:val="21"/>
         </w:rPr>
-        <w:t xml:space="preserve">1.1  Overview of the Internship	1</w:t>
+        <w:t xml:space="preserve">2.1  Problem Statement	3</w:t>
       </w:r>
     </w:p>
     <w:p>
@@ -863,7 +823,7 @@
           <w:sz w:val="21"/>
           <w:szCs w:val="21"/>
         </w:rPr>
-        <w:t xml:space="preserve">1.2  Company Profile	1</w:t>
+        <w:t xml:space="preserve">2.2  Limitations Addressed and Proposed Solution	3</w:t>
       </w:r>
     </w:p>
     <w:p>
@@ -881,7 +841,7 @@
           <w:sz w:val="21"/>
           <w:szCs w:val="21"/>
         </w:rPr>
-        <w:t xml:space="preserve">1.3  Objectives of the Internship	1</w:t>
+        <w:t xml:space="preserve">2.3  Joint Project Teams	3</w:t>
       </w:r>
     </w:p>
     <w:p>
@@ -899,7 +859,25 @@
           <w:sz w:val="21"/>
           <w:szCs w:val="21"/>
         </w:rPr>
-        <w:t xml:space="preserve">1.4  Scope and Organisation of the Report	2</w:t>
+        <w:t xml:space="preserve">2.4  Software Requirements and Development Environment	3</w:t>
+      </w:r>
+    </w:p>
+    <w:p>
+      <w:pPr>
+        <w:tabs>
+          <w:tab w:val="right" w:pos="8660" w:leader="dot"/>
+        </w:tabs>
+        <w:spacing w:after="0" w:before="0" w:line="250"/>
+        <w:ind w:left="440"/>
+      </w:pPr>
+      <w:r>
+        <w:rPr>
+          <w:b w:val="false"/>
+          <w:bCs w:val="false"/>
+          <w:sz w:val="21"/>
+          <w:szCs w:val="21"/>
+        </w:rPr>
+        <w:t xml:space="preserve">2.5  Technology Stack	4</w:t>
       </w:r>
     </w:p>
     <w:p>
@@ -917,7 +895,7 @@
           <w:sz w:val="21"/>
           <w:szCs w:val="21"/>
         </w:rPr>
-        <w:t xml:space="preserve">2. PROJECT OVERVIEW AND REQUIREMENTS	3</w:t>
+        <w:t xml:space="preserve">3. SYSTEM DESIGN	5</w:t>
       </w:r>
     </w:p>
     <w:p>
@@ -935,7 +913,7 @@
           <w:sz w:val="21"/>
           <w:szCs w:val="21"/>
         </w:rPr>
-        <w:t xml:space="preserve">2.1  Problem Statement	3</w:t>
+        <w:t xml:space="preserve">3.1  Overall Architecture	5</w:t>
       </w:r>
     </w:p>
     <w:p>
@@ -953,115 +931,7 @@
           <w:sz w:val="21"/>
           <w:szCs w:val="21"/>
         </w:rPr>
-        <w:t xml:space="preserve">2.2  Limitations Addressed and Proposed Solution	3</w:t>
-      </w:r>
-    </w:p>
-    <w:p>
-      <w:pPr>
-        <w:tabs>
-          <w:tab w:val="right" w:pos="8660" w:leader="dot"/>
-        </w:tabs>
-        <w:spacing w:after="0" w:before="0" w:line="250"/>
-        <w:ind w:left="440"/>
-      </w:pPr>
-      <w:r>
-        <w:rPr>
-          <w:b w:val="false"/>
-          <w:bCs w:val="false"/>
-          <w:sz w:val="21"/>
-          <w:szCs w:val="21"/>
-        </w:rPr>
-        <w:t xml:space="preserve">2.3  Joint Project Teams	3</w:t>
-      </w:r>
-    </w:p>
-    <w:p>
-      <w:pPr>
-        <w:tabs>
-          <w:tab w:val="right" w:pos="8660" w:leader="dot"/>
-        </w:tabs>
-        <w:spacing w:after="0" w:before="0" w:line="250"/>
-        <w:ind w:left="440"/>
-      </w:pPr>
-      <w:r>
-        <w:rPr>
-          <w:b w:val="false"/>
-          <w:bCs w:val="false"/>
-          <w:sz w:val="21"/>
-          <w:szCs w:val="21"/>
-        </w:rPr>
-        <w:t xml:space="preserve">2.4  Software Requirements and Development Environment	3</w:t>
-      </w:r>
-    </w:p>
-    <w:p>
-      <w:pPr>
-        <w:tabs>
-          <w:tab w:val="right" w:pos="8660" w:leader="dot"/>
-        </w:tabs>
-        <w:spacing w:after="0" w:before="0" w:line="250"/>
-        <w:ind w:left="440"/>
-      </w:pPr>
-      <w:r>
-        <w:rPr>
-          <w:b w:val="false"/>
-          <w:bCs w:val="false"/>
-          <w:sz w:val="21"/>
-          <w:szCs w:val="21"/>
-        </w:rPr>
-        <w:t xml:space="preserve">2.5  Technology Stack	4</w:t>
-      </w:r>
-    </w:p>
-    <w:p>
-      <w:pPr>
-        <w:tabs>
-          <w:tab w:val="right" w:pos="8660" w:leader="dot"/>
-        </w:tabs>
-        <w:spacing w:after="20" w:before="50" w:line="250"/>
-        <w:ind w:left="0"/>
-      </w:pPr>
-      <w:r>
-        <w:rPr>
-          <w:b/>
-          <w:bCs/>
-          <w:sz w:val="21"/>
-          <w:szCs w:val="21"/>
-        </w:rPr>
-        <w:t xml:space="preserve">3. SYSTEM DESIGN	5</w:t>
-      </w:r>
-    </w:p>
-    <w:p>
-      <w:pPr>
-        <w:tabs>
-          <w:tab w:val="right" w:pos="8660" w:leader="dot"/>
-        </w:tabs>
-        <w:spacing w:after="0" w:before="0" w:line="250"/>
-        <w:ind w:left="440"/>
-      </w:pPr>
-      <w:r>
-        <w:rPr>
-          <w:b w:val="false"/>
-          <w:bCs w:val="false"/>
-          <w:sz w:val="21"/>
-          <w:szCs w:val="21"/>
-        </w:rPr>
-        <w:t xml:space="preserve">3.1  Overall Architecture	5</w:t>
-      </w:r>
-    </w:p>
-    <w:p>
-      <w:pPr>
-        <w:tabs>
-          <w:tab w:val="right" w:pos="8660" w:leader="dot"/>
-        </w:tabs>
-        <w:spacing w:after="0" w:before="0" w:line="250"/>
-        <w:ind w:left="440"/>
-      </w:pPr>
-      <w:r>
-        <w:rPr>
-          <w:b w:val="false"/>
-          <w:bCs w:val="false"/>
-          <w:sz w:val="21"/>
-          <w:szCs w:val="21"/>
-        </w:rPr>
-        <w:t xml:space="preserve">3.2  Frontend-to-Backend Request Flow	6</w:t>
+        <w:t xml:space="preserve">3.2  Frontend-to-Backend Request Flow	5</w:t>
       </w:r>
     </w:p>
     <w:p>

</xml_diff>